<commit_message>
Test doi entities recognition and parsing [skip-ci]
</commit_message>
<xml_diff>
--- a/tests/_fixtures/a_book/02_b.docx
+++ b/tests/_fixtures/a_book/02_b.docx
@@ -6,13 +6,13 @@
       <w:pPr>
         <w:pStyle w:val="Heading1"/>
         <w:rPr>
-          <w:lang w:val="nl-NL"/>
+          <w:lang w:val="en-US"/>
         </w:rPr>
       </w:pPr>
       <w:bookmarkStart w:id="0" w:name="h1HyperlinksB"/>
       <w:r>
         <w:rPr>
-          <w:lang w:val="nl-NL"/>
+          <w:lang w:val="en-US"/>
         </w:rPr>
         <w:t>Hyperlinks B</w:t>
       </w:r>
@@ -22,253 +22,258 @@
       <w:pPr>
         <w:pStyle w:val="BodyText"/>
         <w:jc w:val="both"/>
-        <w:rPr>
-          <w:color w:val="F2F2F2" w:themeColor="background1" w:themeShade="F2"/>
-          <w:lang w:val="nl-NL"/>
-        </w:rPr>
-      </w:pPr>
-      <w:r>
-        <w:rPr>
-          <w:color w:val="F2F2F2" w:themeColor="background1" w:themeShade="F2"/>
-          <w:lang w:val="nl-NL"/>
-        </w:rPr>
-        <w:t>x</w:t>
-      </w:r>
-    </w:p>
-    <w:p>
-      <w:pPr>
-        <w:pStyle w:val="BodyText"/>
-        <w:jc w:val="both"/>
-        <w:rPr>
-          <w:color w:val="F2F2F2" w:themeColor="background1" w:themeShade="F2"/>
-          <w:lang w:val="nl-NL"/>
-        </w:rPr>
-      </w:pPr>
-      <w:r>
-        <w:rPr>
-          <w:color w:val="F2F2F2" w:themeColor="background1" w:themeShade="F2"/>
-          <w:lang w:val="nl-NL"/>
-        </w:rPr>
-        <w:t>x</w:t>
-      </w:r>
-    </w:p>
-    <w:p>
-      <w:pPr>
-        <w:pStyle w:val="BodyText"/>
-        <w:jc w:val="both"/>
-        <w:rPr>
-          <w:color w:val="F2F2F2" w:themeColor="background1" w:themeShade="F2"/>
-          <w:lang w:val="nl-NL"/>
-        </w:rPr>
-      </w:pPr>
-      <w:r>
-        <w:rPr>
-          <w:color w:val="F2F2F2" w:themeColor="background1" w:themeShade="F2"/>
-          <w:lang w:val="nl-NL"/>
-        </w:rPr>
-        <w:t>x</w:t>
-      </w:r>
-    </w:p>
-    <w:p>
-      <w:pPr>
-        <w:pStyle w:val="BodyText"/>
-        <w:jc w:val="both"/>
-        <w:rPr>
-          <w:color w:val="F2F2F2" w:themeColor="background1" w:themeShade="F2"/>
-          <w:lang w:val="nl-NL"/>
-        </w:rPr>
-      </w:pPr>
-      <w:r>
-        <w:rPr>
-          <w:color w:val="F2F2F2" w:themeColor="background1" w:themeShade="F2"/>
-          <w:lang w:val="nl-NL"/>
-        </w:rPr>
-        <w:t>x</w:t>
-      </w:r>
-    </w:p>
-    <w:p>
-      <w:pPr>
-        <w:pStyle w:val="BodyText"/>
-        <w:jc w:val="both"/>
-        <w:rPr>
-          <w:color w:val="F2F2F2" w:themeColor="background1" w:themeShade="F2"/>
-          <w:lang w:val="nl-NL"/>
-        </w:rPr>
-      </w:pPr>
-      <w:r>
-        <w:rPr>
-          <w:color w:val="F2F2F2" w:themeColor="background1" w:themeShade="F2"/>
-          <w:lang w:val="nl-NL"/>
-        </w:rPr>
-        <w:t>x</w:t>
-      </w:r>
-    </w:p>
-    <w:p>
-      <w:pPr>
-        <w:pStyle w:val="BodyText"/>
-        <w:jc w:val="both"/>
-        <w:rPr>
-          <w:color w:val="F2F2F2" w:themeColor="background1" w:themeShade="F2"/>
-          <w:lang w:val="nl-NL"/>
-        </w:rPr>
-      </w:pPr>
-      <w:r>
-        <w:rPr>
-          <w:color w:val="F2F2F2" w:themeColor="background1" w:themeShade="F2"/>
-          <w:lang w:val="nl-NL"/>
-        </w:rPr>
-        <w:t>x</w:t>
-      </w:r>
-    </w:p>
-    <w:p>
-      <w:pPr>
-        <w:pStyle w:val="BodyText"/>
-        <w:jc w:val="both"/>
-        <w:rPr>
-          <w:color w:val="F2F2F2" w:themeColor="background1" w:themeShade="F2"/>
-          <w:lang w:val="nl-NL"/>
-        </w:rPr>
-      </w:pPr>
-      <w:r>
-        <w:rPr>
-          <w:color w:val="F2F2F2" w:themeColor="background1" w:themeShade="F2"/>
-          <w:lang w:val="nl-NL"/>
-        </w:rPr>
-        <w:t>x</w:t>
-      </w:r>
-    </w:p>
-    <w:p>
-      <w:pPr>
-        <w:pStyle w:val="BodyText"/>
-        <w:jc w:val="both"/>
-        <w:rPr>
-          <w:color w:val="F2F2F2" w:themeColor="background1" w:themeShade="F2"/>
-          <w:lang w:val="nl-NL"/>
-        </w:rPr>
-      </w:pPr>
-      <w:r>
-        <w:rPr>
-          <w:color w:val="F2F2F2" w:themeColor="background1" w:themeShade="F2"/>
-          <w:lang w:val="nl-NL"/>
-        </w:rPr>
-        <w:t>x</w:t>
-      </w:r>
-    </w:p>
-    <w:p>
-      <w:pPr>
-        <w:pStyle w:val="BodyText"/>
-        <w:jc w:val="both"/>
-        <w:rPr>
-          <w:color w:val="F2F2F2" w:themeColor="background1" w:themeShade="F2"/>
-          <w:lang w:val="nl-NL"/>
-        </w:rPr>
-      </w:pPr>
-      <w:r>
-        <w:rPr>
-          <w:color w:val="F2F2F2" w:themeColor="background1" w:themeShade="F2"/>
-          <w:lang w:val="nl-NL"/>
-        </w:rPr>
-        <w:t>x</w:t>
-      </w:r>
-    </w:p>
-    <w:p>
-      <w:pPr>
-        <w:pStyle w:val="BodyText"/>
-        <w:jc w:val="both"/>
-        <w:rPr>
-          <w:color w:val="F2F2F2" w:themeColor="background1" w:themeShade="F2"/>
-          <w:lang w:val="nl-NL"/>
-        </w:rPr>
-      </w:pPr>
-      <w:r>
-        <w:rPr>
-          <w:color w:val="F2F2F2" w:themeColor="background1" w:themeShade="F2"/>
-          <w:lang w:val="nl-NL"/>
-        </w:rPr>
-        <w:t>x</w:t>
-      </w:r>
-    </w:p>
-    <w:p>
-      <w:pPr>
-        <w:pStyle w:val="BodyText"/>
-        <w:jc w:val="both"/>
-        <w:rPr>
-          <w:color w:val="F2F2F2" w:themeColor="background1" w:themeShade="F2"/>
-          <w:lang w:val="nl-NL"/>
-        </w:rPr>
-      </w:pPr>
-      <w:r>
-        <w:rPr>
-          <w:color w:val="F2F2F2" w:themeColor="background1" w:themeShade="F2"/>
-          <w:lang w:val="nl-NL"/>
-        </w:rPr>
-        <w:t>x</w:t>
-      </w:r>
-    </w:p>
-    <w:p>
-      <w:pPr>
-        <w:pStyle w:val="BodyText"/>
-        <w:jc w:val="both"/>
-        <w:rPr>
-          <w:color w:val="F2F2F2" w:themeColor="background1" w:themeShade="F2"/>
-          <w:lang w:val="nl-NL"/>
-        </w:rPr>
-      </w:pPr>
-      <w:r>
-        <w:rPr>
-          <w:color w:val="F2F2F2" w:themeColor="background1" w:themeShade="F2"/>
-          <w:lang w:val="nl-NL"/>
-        </w:rPr>
-        <w:t>x</w:t>
-      </w:r>
-    </w:p>
-    <w:p>
-      <w:pPr>
-        <w:pStyle w:val="BodyText"/>
-        <w:jc w:val="both"/>
-        <w:rPr>
-          <w:color w:val="F2F2F2" w:themeColor="background1" w:themeShade="F2"/>
-          <w:lang w:val="nl-NL"/>
-        </w:rPr>
-      </w:pPr>
-      <w:r>
-        <w:rPr>
-          <w:color w:val="F2F2F2" w:themeColor="background1" w:themeShade="F2"/>
-          <w:lang w:val="nl-NL"/>
-        </w:rPr>
-        <w:t>x</w:t>
-      </w:r>
-    </w:p>
-    <w:p>
-      <w:pPr>
-        <w:pStyle w:val="BodyText"/>
-        <w:jc w:val="both"/>
-        <w:rPr>
-          <w:color w:val="F2F2F2" w:themeColor="background1" w:themeShade="F2"/>
-          <w:lang w:val="nl-NL"/>
-        </w:rPr>
-      </w:pPr>
-      <w:r>
-        <w:rPr>
-          <w:color w:val="F2F2F2" w:themeColor="background1" w:themeShade="F2"/>
-          <w:lang w:val="nl-NL"/>
-        </w:rPr>
-        <w:t>x</w:t>
-      </w:r>
-    </w:p>
-    <w:p>
-      <w:pPr>
-        <w:pStyle w:val="BodyText"/>
-        <w:jc w:val="both"/>
-        <w:rPr>
-          <w:color w:val="F2F2F2" w:themeColor="background1" w:themeShade="F2"/>
-          <w:lang w:val="nl-NL"/>
-        </w:rPr>
-      </w:pPr>
-      <w:r>
-        <w:rPr>
-          <w:color w:val="F2F2F2" w:themeColor="background1" w:themeShade="F2"/>
-          <w:lang w:val="nl-NL"/>
+      </w:pPr>
+      <w:r>
+        <w:t>Few DOI id inside a paragraph</w:t>
+      </w:r>
+      <w:r>
+        <w:t xml:space="preserve">: </w:t>
+      </w:r>
+      <w:r>
+        <w:t>DOI</w:t>
+      </w:r>
+      <w:r>
+        <w:t>:10.1287/isre.7.1.111</w:t>
+      </w:r>
+      <w:r>
+        <w:t xml:space="preserve">, </w:t>
+      </w:r>
+      <w:hyperlink r:id="rId7" w:history="1">
+        <w:r>
+          <w:rPr>
+            <w:rStyle w:val="Hyperlink"/>
+          </w:rPr>
+          <w:t>https://doi.org/10.1093/llc/fqy085</w:t>
+        </w:r>
+      </w:hyperlink>
+      <w:r>
+        <w:t xml:space="preserve">, also a raw doi </w:t>
+      </w:r>
+      <w:r>
+        <w:t>10.1234/example</w:t>
+      </w:r>
+      <w:r>
+        <w:t>.</w:t>
+      </w:r>
+      <w:r>
+        <w:t xml:space="preserve"> Doi in footnote</w:t>
+      </w:r>
+      <w:r>
+        <w:rPr>
+          <w:rStyle w:val="FootnoteReference"/>
+        </w:rPr>
+        <w:footnoteReference w:id="1"/>
+      </w:r>
+      <w:r>
+        <w:t>.</w:t>
+      </w:r>
+    </w:p>
+    <w:p>
+      <w:pPr>
+        <w:pStyle w:val="BodyText"/>
+        <w:jc w:val="both"/>
+        <w:rPr>
+          <w:color w:val="F2F2F2" w:themeColor="background1" w:themeShade="F2"/>
+        </w:rPr>
+      </w:pPr>
+      <w:r>
+        <w:rPr>
+          <w:color w:val="F2F2F2" w:themeColor="background1" w:themeShade="F2"/>
+        </w:rPr>
+        <w:t>x</w:t>
+      </w:r>
+    </w:p>
+    <w:p>
+      <w:pPr>
+        <w:pStyle w:val="BodyText"/>
+        <w:jc w:val="both"/>
+        <w:rPr>
+          <w:color w:val="F2F2F2" w:themeColor="background1" w:themeShade="F2"/>
+        </w:rPr>
+      </w:pPr>
+      <w:r>
+        <w:rPr>
+          <w:color w:val="F2F2F2" w:themeColor="background1" w:themeShade="F2"/>
+        </w:rPr>
+        <w:t>x</w:t>
+      </w:r>
+    </w:p>
+    <w:p>
+      <w:pPr>
+        <w:pStyle w:val="BodyText"/>
+        <w:jc w:val="both"/>
+        <w:rPr>
+          <w:color w:val="F2F2F2" w:themeColor="background1" w:themeShade="F2"/>
+        </w:rPr>
+      </w:pPr>
+      <w:r>
+        <w:rPr>
+          <w:color w:val="F2F2F2" w:themeColor="background1" w:themeShade="F2"/>
+        </w:rPr>
+        <w:t>x</w:t>
+      </w:r>
+    </w:p>
+    <w:p>
+      <w:pPr>
+        <w:pStyle w:val="BodyText"/>
+        <w:jc w:val="both"/>
+        <w:rPr>
+          <w:color w:val="F2F2F2" w:themeColor="background1" w:themeShade="F2"/>
+        </w:rPr>
+      </w:pPr>
+      <w:r>
+        <w:rPr>
+          <w:color w:val="F2F2F2" w:themeColor="background1" w:themeShade="F2"/>
+        </w:rPr>
+        <w:t>x</w:t>
+      </w:r>
+    </w:p>
+    <w:p>
+      <w:pPr>
+        <w:pStyle w:val="BodyText"/>
+        <w:jc w:val="both"/>
+        <w:rPr>
+          <w:color w:val="F2F2F2" w:themeColor="background1" w:themeShade="F2"/>
+        </w:rPr>
+      </w:pPr>
+      <w:r>
+        <w:rPr>
+          <w:color w:val="F2F2F2" w:themeColor="background1" w:themeShade="F2"/>
+        </w:rPr>
+        <w:t>x</w:t>
+      </w:r>
+    </w:p>
+    <w:p>
+      <w:pPr>
+        <w:pStyle w:val="BodyText"/>
+        <w:jc w:val="both"/>
+        <w:rPr>
+          <w:color w:val="F2F2F2" w:themeColor="background1" w:themeShade="F2"/>
+        </w:rPr>
+      </w:pPr>
+      <w:r>
+        <w:rPr>
+          <w:color w:val="F2F2F2" w:themeColor="background1" w:themeShade="F2"/>
+        </w:rPr>
+        <w:t>x</w:t>
+      </w:r>
+    </w:p>
+    <w:p>
+      <w:pPr>
+        <w:pStyle w:val="BodyText"/>
+        <w:jc w:val="both"/>
+        <w:rPr>
+          <w:color w:val="F2F2F2" w:themeColor="background1" w:themeShade="F2"/>
+        </w:rPr>
+      </w:pPr>
+      <w:r>
+        <w:rPr>
+          <w:color w:val="F2F2F2" w:themeColor="background1" w:themeShade="F2"/>
+        </w:rPr>
+        <w:t>x</w:t>
+      </w:r>
+    </w:p>
+    <w:p>
+      <w:pPr>
+        <w:pStyle w:val="BodyText"/>
+        <w:jc w:val="both"/>
+        <w:rPr>
+          <w:color w:val="F2F2F2" w:themeColor="background1" w:themeShade="F2"/>
+        </w:rPr>
+      </w:pPr>
+      <w:r>
+        <w:rPr>
+          <w:color w:val="F2F2F2" w:themeColor="background1" w:themeShade="F2"/>
+        </w:rPr>
+        <w:t>x</w:t>
+      </w:r>
+    </w:p>
+    <w:p>
+      <w:pPr>
+        <w:pStyle w:val="BodyText"/>
+        <w:jc w:val="both"/>
+        <w:rPr>
+          <w:color w:val="F2F2F2" w:themeColor="background1" w:themeShade="F2"/>
+        </w:rPr>
+      </w:pPr>
+      <w:r>
+        <w:rPr>
+          <w:color w:val="F2F2F2" w:themeColor="background1" w:themeShade="F2"/>
+        </w:rPr>
+        <w:t>x</w:t>
+      </w:r>
+    </w:p>
+    <w:p>
+      <w:pPr>
+        <w:pStyle w:val="BodyText"/>
+        <w:jc w:val="both"/>
+        <w:rPr>
+          <w:color w:val="F2F2F2" w:themeColor="background1" w:themeShade="F2"/>
+        </w:rPr>
+      </w:pPr>
+      <w:r>
+        <w:rPr>
+          <w:color w:val="F2F2F2" w:themeColor="background1" w:themeShade="F2"/>
+        </w:rPr>
+        <w:t>x</w:t>
+      </w:r>
+    </w:p>
+    <w:p>
+      <w:pPr>
+        <w:pStyle w:val="BodyText"/>
+        <w:jc w:val="both"/>
+        <w:rPr>
+          <w:color w:val="F2F2F2" w:themeColor="background1" w:themeShade="F2"/>
+        </w:rPr>
+      </w:pPr>
+      <w:r>
+        <w:rPr>
+          <w:color w:val="F2F2F2" w:themeColor="background1" w:themeShade="F2"/>
+        </w:rPr>
+        <w:t>x</w:t>
+      </w:r>
+    </w:p>
+    <w:p>
+      <w:pPr>
+        <w:pStyle w:val="BodyText"/>
+        <w:jc w:val="both"/>
+        <w:rPr>
+          <w:color w:val="F2F2F2" w:themeColor="background1" w:themeShade="F2"/>
+        </w:rPr>
+      </w:pPr>
+      <w:r>
+        <w:rPr>
+          <w:color w:val="F2F2F2" w:themeColor="background1" w:themeShade="F2"/>
+        </w:rPr>
+        <w:t>x</w:t>
+      </w:r>
+    </w:p>
+    <w:p>
+      <w:pPr>
+        <w:pStyle w:val="BodyText"/>
+        <w:jc w:val="both"/>
+        <w:rPr>
+          <w:color w:val="F2F2F2" w:themeColor="background1" w:themeShade="F2"/>
+        </w:rPr>
+      </w:pPr>
+      <w:r>
+        <w:rPr>
+          <w:color w:val="F2F2F2" w:themeColor="background1" w:themeShade="F2"/>
+        </w:rPr>
+        <w:t>x</w:t>
+      </w:r>
+    </w:p>
+    <w:p>
+      <w:pPr>
+        <w:pStyle w:val="BodyText"/>
+        <w:jc w:val="both"/>
+        <w:rPr>
+          <w:color w:val="F2F2F2" w:themeColor="background1" w:themeShade="F2"/>
+        </w:rPr>
+      </w:pPr>
+      <w:r>
+        <w:rPr>
+          <w:color w:val="F2F2F2" w:themeColor="background1" w:themeShade="F2"/>
         </w:rPr>
         <w:t>x</w:t>
       </w:r>
@@ -447,22 +452,22 @@
         <w:rPr>
           <w:color w:val="F2F2F2" w:themeColor="background1" w:themeShade="F2"/>
         </w:rPr>
-        <w:t>x</w:t>
-      </w:r>
-    </w:p>
-    <w:p>
-      <w:pPr>
-        <w:pStyle w:val="BodyText"/>
-        <w:jc w:val="both"/>
-        <w:rPr>
-          <w:color w:val="F2F2F2" w:themeColor="background1" w:themeShade="F2"/>
-        </w:rPr>
-      </w:pPr>
-      <w:r>
-        <w:rPr>
-          <w:color w:val="F2F2F2" w:themeColor="background1" w:themeShade="F2"/>
-        </w:rPr>
         <w:lastRenderedPageBreak/>
+        <w:t>x</w:t>
+      </w:r>
+    </w:p>
+    <w:p>
+      <w:pPr>
+        <w:pStyle w:val="BodyText"/>
+        <w:jc w:val="both"/>
+        <w:rPr>
+          <w:color w:val="F2F2F2" w:themeColor="background1" w:themeShade="F2"/>
+        </w:rPr>
+      </w:pPr>
+      <w:r>
+        <w:rPr>
+          <w:color w:val="F2F2F2" w:themeColor="background1" w:themeShade="F2"/>
+        </w:rPr>
         <w:t>x</w:t>
       </w:r>
     </w:p>
@@ -876,8 +881,8 @@
             <v:path o:extrusionok="f" gradientshapeok="t" o:connecttype="rect"/>
             <o:lock v:ext="edit" aspectratio="t"/>
           </v:shapetype>
-          <v:shape id="_x0000_i1025" type="#_x0000_t75" alt="The&#10;&#10;Alt&#10;&#10;Text" style="width:7.45pt;height:7.45pt;visibility:visible;mso-wrap-style:square">
-            <v:imagedata r:id="rId11" o:title="The&#10;&#10;Alt&#10;&#10;Text"/>
+          <v:shape id="_x0000_i1025" type="#_x0000_t75" alt="The&#10;&#10;Alt&#10;&#10;Text" style="width:7.5pt;height:7.5pt;visibility:visible;mso-wrap-style:square">
+            <v:imagedata r:id="rId12" o:title="The&#10;&#10;Alt&#10;&#10;Text"/>
           </v:shape>
         </w:pict>
       </w:r>
@@ -1014,22 +1019,22 @@
         <w:rPr>
           <w:color w:val="F2F2F2" w:themeColor="background1" w:themeShade="F2"/>
         </w:rPr>
-        <w:t>x</w:t>
-      </w:r>
-    </w:p>
-    <w:p>
-      <w:pPr>
-        <w:pStyle w:val="BodyText"/>
-        <w:jc w:val="both"/>
-        <w:rPr>
-          <w:color w:val="F2F2F2" w:themeColor="background1" w:themeShade="F2"/>
-        </w:rPr>
-      </w:pPr>
-      <w:r>
-        <w:rPr>
-          <w:color w:val="F2F2F2" w:themeColor="background1" w:themeShade="F2"/>
-        </w:rPr>
         <w:lastRenderedPageBreak/>
+        <w:t>x</w:t>
+      </w:r>
+    </w:p>
+    <w:p>
+      <w:pPr>
+        <w:pStyle w:val="BodyText"/>
+        <w:jc w:val="both"/>
+        <w:rPr>
+          <w:color w:val="F2F2F2" w:themeColor="background1" w:themeShade="F2"/>
+        </w:rPr>
+      </w:pPr>
+      <w:r>
+        <w:rPr>
+          <w:color w:val="F2F2F2" w:themeColor="background1" w:themeShade="F2"/>
+        </w:rPr>
         <w:t>x</w:t>
       </w:r>
     </w:p>
@@ -1587,22 +1592,22 @@
         <w:rPr>
           <w:color w:val="F2F2F2" w:themeColor="background1" w:themeShade="F2"/>
         </w:rPr>
-        <w:t>x</w:t>
-      </w:r>
-    </w:p>
-    <w:p>
-      <w:pPr>
-        <w:pStyle w:val="BodyText"/>
-        <w:jc w:val="both"/>
-        <w:rPr>
-          <w:color w:val="F2F2F2" w:themeColor="background1" w:themeShade="F2"/>
-        </w:rPr>
-      </w:pPr>
-      <w:r>
-        <w:rPr>
-          <w:color w:val="F2F2F2" w:themeColor="background1" w:themeShade="F2"/>
-        </w:rPr>
         <w:lastRenderedPageBreak/>
+        <w:t>x</w:t>
+      </w:r>
+    </w:p>
+    <w:p>
+      <w:pPr>
+        <w:pStyle w:val="BodyText"/>
+        <w:jc w:val="both"/>
+        <w:rPr>
+          <w:color w:val="F2F2F2" w:themeColor="background1" w:themeShade="F2"/>
+        </w:rPr>
+      </w:pPr>
+      <w:r>
+        <w:rPr>
+          <w:color w:val="F2F2F2" w:themeColor="background1" w:themeShade="F2"/>
+        </w:rPr>
         <w:t>x</w:t>
       </w:r>
     </w:p>
@@ -1839,6 +1844,53 @@
       </w:pPr>
       <w:r>
         <w:continuationSeparator/>
+      </w:r>
+    </w:p>
+  </w:footnote>
+  <w:footnote w:id="1">
+    <w:p>
+      <w:pPr>
+        <w:pStyle w:val="FootnoteText"/>
+        <w:rPr>
+          <w:lang w:val="en-US"/>
+        </w:rPr>
+      </w:pPr>
+      <w:r>
+        <w:rPr>
+          <w:rStyle w:val="FootnoteReference"/>
+        </w:rPr>
+        <w:footnoteRef/>
+      </w:r>
+      <w:r>
+        <w:t xml:space="preserve"> </w:t>
+      </w:r>
+      <w:r>
+        <w:rPr>
+          <w:lang w:val="en-US"/>
+        </w:rPr>
+        <w:t xml:space="preserve">See </w:t>
+      </w:r>
+      <w:hyperlink r:id="rId1" w:history="1">
+        <w:r>
+          <w:rPr>
+            <w:rStyle w:val="Hyperlink"/>
+            <w:lang w:val="en-US"/>
+          </w:rPr>
+          <w:t>https://dx.doi.org/</w:t>
+        </w:r>
+        <w:r>
+          <w:rPr>
+            <w:rStyle w:val="Hyperlink"/>
+            <w:lang w:val="en-US"/>
+          </w:rPr>
+          <w:t>10.1000/182</w:t>
+        </w:r>
+      </w:hyperlink>
+      <w:r>
+        <w:rPr>
+          <w:lang w:val="en-US"/>
+        </w:rPr>
+        <w:t>.</w:t>
       </w:r>
     </w:p>
   </w:footnote>
@@ -2298,7 +2350,6 @@
   <w:style w:type="character" w:default="1" w:styleId="DefaultParagraphFont">
     <w:name w:val="Default Paragraph Font"/>
     <w:uiPriority w:val="1"/>
-    <w:semiHidden/>
     <w:unhideWhenUsed/>
   </w:style>
   <w:style w:type="table" w:default="1" w:styleId="TableNormal">

</xml_diff>